<commit_message>
User guide: point testers to test-documents/adopt-test.docx
Regenerate USER_GUIDE.docx from the edited Markdown.

Co-Authored-By: Claude Opus 4.8 (1M context) <noreply@anthropic.com>
</commit_message>
<xml_diff>
--- a/docs/USER_GUIDE.docx
+++ b/docs/USER_GUIDE.docx
@@ -101,6 +101,19 @@
       </w:r>
       <w:r>
         <w:t xml:space="preserve"> — paste or load poetry text and convert it into a formatted block.</w:t>
+      </w:r>
+    </w:p>
+    <w:p>
+      <w:pPr>
+        <w:pStyle w:val="ListNumber"/>
+      </w:pPr>
+      <w:r>
+        <w:t>For testing the different modes, you can use test-documents/adopt-test.docx This file has a myriad of different bandhs to illustrate</w:t>
+      </w:r>
+    </w:p>
+    <w:p>
+      <w:r>
+        <w:t>how existing poetry can be converted and enhanced using the add-in.</w:t>
       </w:r>
     </w:p>
     <w:p>

</xml_diff>